<commit_message>
Remove data README references and prepare Exercise 5 solution uploads
</commit_message>
<xml_diff>
--- a/Exercise 5 Solution.docx
+++ b/Exercise 5 Solution.docx
@@ -32,7 +32,7 @@
         <w:pStyle w:val="FirstParagraph"/>
       </w:pPr>
       <w:r>
-        <w:t xml:space="preserve">The retailer wants to understand how past spending differs with household income and size before planning outreach. This solution includes the model and five-point rubric. Both slopes are positive; neither establishes a causal outreach effect.</w:t>
+        <w:t xml:space="preserve">The retailer wants to understand how past spending differs with household income and size before planning outreach. This solution includes the model and five-point rubric.</w:t>
       </w:r>
     </w:p>
     <w:bookmarkEnd w:id="9"/>
@@ -426,29 +426,6 @@
         <w:t xml:space="preserve">)</w:t>
       </w:r>
     </w:p>
-    <w:p>
-      <w:pPr>
-        <w:pStyle w:val="FirstParagraph"/>
-      </w:pPr>
-      <w:r>
-        <w:t xml:space="preserve">These semi-synthetic teaching data describe a fictional retailer. The dictionary and</w:t>
-      </w:r>
-      <w:r>
-        <w:t xml:space="preserve"> </w:t>
-      </w:r>
-      <w:r>
-        <w:rPr>
-          <w:rStyle w:val="VerbatimChar"/>
-        </w:rPr>
-        <w:t xml:space="preserve">customer-data-README.md</w:t>
-      </w:r>
-      <w:r>
-        <w:t xml:space="preserve"> </w:t>
-      </w:r>
-      <w:r>
-        <w:t xml:space="preserve">provide the definitions, context, and attribution.</w:t>
-      </w:r>
-    </w:p>
     <w:bookmarkEnd w:id="12"/>
     <w:bookmarkStart w:id="13" w:name="prepare-the-model-data"/>
     <w:p>
@@ -627,7 +604,7 @@
         <w:t xml:space="preserve">9,800 customers</w:t>
       </w:r>
       <w:r>
-        <w:t xml:space="preserve">. The other 200 customers have missing income. Missing values in variables outside this model, such as home size, do not require excluding additional customers here.</w:t>
+        <w:t xml:space="preserve">. The other 200 customers have missing income.</w:t>
       </w:r>
     </w:p>
     <w:bookmarkEnd w:id="13"/>
@@ -832,7 +809,7 @@
         <w:pStyle w:val="FirstParagraph"/>
       </w:pPr>
       <w:r>
-        <w:t xml:space="preserve">Display the coefficient estimates. The lecture focuses on these estimates; inference about their uncertainty follows in the next lecture.</w:t>
+        <w:t xml:space="preserve">Display the coefficient estimates.</w:t>
       </w:r>
     </w:p>
     <w:p>
@@ -897,232 +874,65 @@
         <w:rPr>
           <w:rStyle w:val="NormalTok"/>
         </w:rPr>
-        <w:t xml:space="preserve">(term, estimate) </w:t>
-      </w:r>
-      <w:r>
-        <w:rPr>
-          <w:rStyle w:val="SpecialCharTok"/>
-        </w:rPr>
-        <w:t xml:space="preserve">|&gt;</w:t>
+        <w:t xml:space="preserve">(term, estimate)</w:t>
+      </w:r>
+    </w:p>
+    <w:p>
+      <w:pPr>
+        <w:pStyle w:val="SourceCode"/>
+      </w:pPr>
+      <w:r>
+        <w:rPr>
+          <w:rStyle w:val="VerbatimChar"/>
+        </w:rPr>
+        <w:t xml:space="preserve"># A tibble: 3 x 2</w:t>
       </w:r>
       <w:r>
         <w:br/>
       </w:r>
       <w:r>
         <w:rPr>
-          <w:rStyle w:val="NormalTok"/>
-        </w:rPr>
-        <w:t xml:space="preserve">  knitr</w:t>
-      </w:r>
-      <w:r>
-        <w:rPr>
-          <w:rStyle w:val="SpecialCharTok"/>
-        </w:rPr>
-        <w:t xml:space="preserve">::</w:t>
-      </w:r>
-      <w:r>
-        <w:rPr>
-          <w:rStyle w:val="FunctionTok"/>
-        </w:rPr>
-        <w:t xml:space="preserve">kable</w:t>
-      </w:r>
-      <w:r>
-        <w:rPr>
-          <w:rStyle w:val="NormalTok"/>
-        </w:rPr>
-        <w:t xml:space="preserve">(</w:t>
-      </w:r>
-      <w:r>
-        <w:rPr>
-          <w:rStyle w:val="AttributeTok"/>
-        </w:rPr>
-        <w:t xml:space="preserve">digits =</w:t>
-      </w:r>
-      <w:r>
-        <w:rPr>
-          <w:rStyle w:val="NormalTok"/>
-        </w:rPr>
-        <w:t xml:space="preserve"> </w:t>
-      </w:r>
-      <w:r>
-        <w:rPr>
-          <w:rStyle w:val="DecValTok"/>
-        </w:rPr>
-        <w:t xml:space="preserve">3</w:t>
-      </w:r>
-      <w:r>
-        <w:rPr>
-          <w:rStyle w:val="NormalTok"/>
-        </w:rPr>
-        <w:t xml:space="preserve">, </w:t>
-      </w:r>
-      <w:r>
-        <w:rPr>
-          <w:rStyle w:val="AttributeTok"/>
-        </w:rPr>
-        <w:t xml:space="preserve">col.names =</w:t>
-      </w:r>
-      <w:r>
-        <w:rPr>
-          <w:rStyle w:val="NormalTok"/>
-        </w:rPr>
-        <w:t xml:space="preserve"> </w:t>
-      </w:r>
-      <w:r>
-        <w:rPr>
-          <w:rStyle w:val="FunctionTok"/>
-        </w:rPr>
-        <w:t xml:space="preserve">c</w:t>
-      </w:r>
-      <w:r>
-        <w:rPr>
-          <w:rStyle w:val="NormalTok"/>
-        </w:rPr>
-        <w:t xml:space="preserve">(</w:t>
-      </w:r>
-      <w:r>
-        <w:rPr>
-          <w:rStyle w:val="StringTok"/>
-        </w:rPr>
-        <w:t xml:space="preserve">"Term"</w:t>
-      </w:r>
-      <w:r>
-        <w:rPr>
-          <w:rStyle w:val="NormalTok"/>
-        </w:rPr>
-        <w:t xml:space="preserve">, </w:t>
-      </w:r>
-      <w:r>
-        <w:rPr>
-          <w:rStyle w:val="StringTok"/>
-        </w:rPr>
-        <w:t xml:space="preserve">"Estimate"</w:t>
-      </w:r>
-      <w:r>
-        <w:rPr>
-          <w:rStyle w:val="NormalTok"/>
-        </w:rPr>
-        <w:t xml:space="preserve">))</w:t>
-      </w:r>
-    </w:p>
-    <w:tbl>
-      <w:tblPr>
-        <w:tblStyle w:val="Table"/>
-        <w:tblW w:type="auto" w:w="0"/>
-        <w:tblLook w:firstRow="1" w:lastRow="0" w:firstColumn="0" w:lastColumn="0" w:noHBand="0" w:noVBand="0" w:val="0020"/>
-      </w:tblPr>
-      <w:tblGrid>
-        <w:gridCol w:w="3960"/>
-        <w:gridCol w:w="3960"/>
-      </w:tblGrid>
-      <w:tr>
-        <w:trPr>
-          <w:tblHeader w:val="on"/>
-        </w:trPr>
-        <w:tc>
-          <w:tcPr/>
-          <w:p>
-            <w:pPr>
-              <w:pStyle w:val="Compact"/>
-              <w:jc w:val="left"/>
-            </w:pPr>
-            <w:r>
-              <w:t xml:space="preserve">Term</w:t>
-            </w:r>
-          </w:p>
-        </w:tc>
-        <w:tc>
-          <w:tcPr/>
-          <w:p>
-            <w:pPr>
-              <w:pStyle w:val="Compact"/>
-              <w:jc w:val="right"/>
-            </w:pPr>
-            <w:r>
-              <w:t xml:space="preserve">Estimate</w:t>
-            </w:r>
-          </w:p>
-        </w:tc>
-      </w:tr>
-      <w:tr>
-        <w:tc>
-          <w:tcPr/>
-          <w:p>
-            <w:pPr>
-              <w:pStyle w:val="Compact"/>
-              <w:jc w:val="left"/>
-            </w:pPr>
-            <w:r>
-              <w:t xml:space="preserve">(Intercept)</w:t>
-            </w:r>
-          </w:p>
-        </w:tc>
-        <w:tc>
-          <w:tcPr/>
-          <w:p>
-            <w:pPr>
-              <w:pStyle w:val="Compact"/>
-              <w:jc w:val="right"/>
-            </w:pPr>
-            <w:r>
-              <w:t xml:space="preserve">648.567</w:t>
-            </w:r>
-          </w:p>
-        </w:tc>
-      </w:tr>
-      <w:tr>
-        <w:tc>
-          <w:tcPr/>
-          <w:p>
-            <w:pPr>
-              <w:pStyle w:val="Compact"/>
-              <w:jc w:val="left"/>
-            </w:pPr>
-            <w:r>
-              <w:t xml:space="preserve">IncomeThousands</w:t>
-            </w:r>
-          </w:p>
-        </w:tc>
-        <w:tc>
-          <w:tcPr/>
-          <w:p>
-            <w:pPr>
-              <w:pStyle w:val="Compact"/>
-              <w:jc w:val="right"/>
-            </w:pPr>
-            <w:r>
-              <w:t xml:space="preserve">2.522</w:t>
-            </w:r>
-          </w:p>
-        </w:tc>
-      </w:tr>
-      <w:tr>
-        <w:tc>
-          <w:tcPr/>
-          <w:p>
-            <w:pPr>
-              <w:pStyle w:val="Compact"/>
-              <w:jc w:val="left"/>
-            </w:pPr>
-            <w:r>
-              <w:t xml:space="preserve">HouseholdSize</w:t>
-            </w:r>
-          </w:p>
-        </w:tc>
-        <w:tc>
-          <w:tcPr/>
-          <w:p>
-            <w:pPr>
-              <w:pStyle w:val="Compact"/>
-              <w:jc w:val="right"/>
-            </w:pPr>
-            <w:r>
-              <w:t xml:space="preserve">46.851</w:t>
-            </w:r>
-          </w:p>
-        </w:tc>
-      </w:tr>
-    </w:tbl>
+          <w:rStyle w:val="VerbatimChar"/>
+        </w:rPr>
+        <w:t xml:space="preserve">  term            estimate</w:t>
+      </w:r>
+      <w:r>
+        <w:br/>
+      </w:r>
+      <w:r>
+        <w:rPr>
+          <w:rStyle w:val="VerbatimChar"/>
+        </w:rPr>
+        <w:t xml:space="preserve">  &lt;chr&gt;              &lt;dbl&gt;</w:t>
+      </w:r>
+      <w:r>
+        <w:br/>
+      </w:r>
+      <w:r>
+        <w:rPr>
+          <w:rStyle w:val="VerbatimChar"/>
+        </w:rPr>
+        <w:t xml:space="preserve">1 (Intercept)       649.  </w:t>
+      </w:r>
+      <w:r>
+        <w:br/>
+      </w:r>
+      <w:r>
+        <w:rPr>
+          <w:rStyle w:val="VerbatimChar"/>
+        </w:rPr>
+        <w:t xml:space="preserve">2 IncomeThousands     2.52</w:t>
+      </w:r>
+      <w:r>
+        <w:br/>
+      </w:r>
+      <w:r>
+        <w:rPr>
+          <w:rStyle w:val="VerbatimChar"/>
+        </w:rPr>
+        <w:t xml:space="preserve">3 HouseholdSize      46.9 </w:t>
+      </w:r>
+    </w:p>
     <w:bookmarkEnd w:id="15"/>
     <w:bookmarkStart w:id="16" w:name="interpretation-for-the-retailer"/>
     <w:p>
@@ -1236,7 +1046,7 @@
         <w:pStyle w:val="FirstParagraph"/>
       </w:pPr>
       <w:r>
-        <w:t xml:space="preserve">Customers with higher income and larger households tend to have higher past spending in this model. That can inform a description of customer profiles, but it does not establish which outreach would increase spending. These characteristics were not randomly assigned, other influences may explain part of the associations, and historical spending is not an outcome of the later email campaign.</w:t>
+        <w:t xml:space="preserve">Customers with higher income and larger households tend to have higher past spending in this model. That can inform a description of customer profiles, but it does not establish which outreach would increase spending. These characteristics were not randomly assigned, other influences may explain part of the associations.</w:t>
       </w:r>
     </w:p>
     <w:bookmarkEnd w:id="16"/>

</xml_diff>